<commit_message>
ML-000 - github link
</commit_message>
<xml_diff>
--- a/exam/results/Exam - Vincze Zoltán.docx
+++ b/exam/results/Exam - Vincze Zoltán.docx
@@ -7,44 +7,56 @@
         <w:pStyle w:val="Cmsor2"/>
       </w:pPr>
       <w:r>
+        <w:t>Feladat elérhetősége:</w:t>
+      </w:r>
+    </w:p>
+    <w:p>
+      <w:pPr>
+        <w:pStyle w:val="Cmsor2"/>
+      </w:pPr>
+      <w:hyperlink r:id="rId5" w:history="1">
+        <w:r>
+          <w:rPr>
+            <w:rStyle w:val="Hiperhivatkozs"/>
+          </w:rPr>
+          <w:t>cubix-ml-models/exam at m</w:t>
+        </w:r>
+        <w:r>
+          <w:rPr>
+            <w:rStyle w:val="Hiperhivatkozs"/>
+          </w:rPr>
+          <w:t>a</w:t>
+        </w:r>
+        <w:r>
+          <w:rPr>
+            <w:rStyle w:val="Hiperhivatkozs"/>
+          </w:rPr>
+          <w:t>in · ZoltanV/cubix-ml-models</w:t>
+        </w:r>
+      </w:hyperlink>
+    </w:p>
+    <w:p>
+      <w:r>
+        <w:t xml:space="preserve">exam </w:t>
+      </w:r>
+      <w:r>
+        <w:t>mappa</w:t>
+      </w:r>
+    </w:p>
+    <w:p>
+      <w:pPr>
+        <w:pStyle w:val="Cmsor2"/>
+      </w:pPr>
+      <w:r>
+        <w:br/>
+      </w:r>
+      <w:r>
         <w:t>Script bemutatása:</w:t>
       </w:r>
     </w:p>
     <w:p>
       <w:r>
-        <w:t xml:space="preserve">Az online_retail_workshop.py először letölti az Online </w:t>
-      </w:r>
-      <w:proofErr w:type="spellStart"/>
-      <w:r>
-        <w:t>Retail</w:t>
-      </w:r>
-      <w:proofErr w:type="spellEnd"/>
-      <w:r>
-        <w:t xml:space="preserve"> adathalmazt </w:t>
-      </w:r>
-      <w:proofErr w:type="spellStart"/>
-      <w:r>
-        <w:t>xls</w:t>
-      </w:r>
-      <w:proofErr w:type="spellEnd"/>
-      <w:r>
-        <w:t xml:space="preserve">-ben, majd átkonvertálja </w:t>
-      </w:r>
-      <w:proofErr w:type="spellStart"/>
-      <w:r>
-        <w:t>csv</w:t>
-      </w:r>
-      <w:proofErr w:type="spellEnd"/>
-      <w:r>
-        <w:t xml:space="preserve">-re, utána feldolgozza a következő </w:t>
-      </w:r>
-      <w:proofErr w:type="spellStart"/>
-      <w:r>
-        <w:t>képpen</w:t>
-      </w:r>
-      <w:proofErr w:type="spellEnd"/>
-      <w:r>
-        <w:t>:</w:t>
+        <w:t>Az online_retail_workshop.py először letölti az Online Retail adathalmazt xls-ben, majd átkonvertálja csv-re, utána feldolgozza a következő képpen:</w:t>
       </w:r>
     </w:p>
     <w:p>
@@ -74,84 +86,27 @@
           <w:szCs w:val="20"/>
         </w:rPr>
       </w:pPr>
-      <w:proofErr w:type="spellStart"/>
-      <w:r>
-        <w:rPr>
-          <w:sz w:val="20"/>
-          <w:szCs w:val="20"/>
-        </w:rPr>
-        <w:t>Pandas-szal</w:t>
-      </w:r>
-      <w:proofErr w:type="spellEnd"/>
-      <w:r>
-        <w:rPr>
-          <w:sz w:val="20"/>
-          <w:szCs w:val="20"/>
-        </w:rPr>
-        <w:t xml:space="preserve"> beolvassuk a CSV fájlt (</w:t>
-      </w:r>
-      <w:proofErr w:type="spellStart"/>
-      <w:r>
-        <w:rPr>
-          <w:sz w:val="20"/>
-          <w:szCs w:val="20"/>
-        </w:rPr>
-        <w:t>InvoiceDate</w:t>
-      </w:r>
-      <w:proofErr w:type="spellEnd"/>
-      <w:r>
-        <w:rPr>
-          <w:sz w:val="20"/>
-          <w:szCs w:val="20"/>
-        </w:rPr>
-        <w:t xml:space="preserve"> oszlop dátumként).</w:t>
-      </w:r>
-    </w:p>
-    <w:p>
-      <w:pPr>
-        <w:rPr>
-          <w:sz w:val="20"/>
-          <w:szCs w:val="20"/>
-        </w:rPr>
-      </w:pPr>
-      <w:r>
-        <w:rPr>
-          <w:sz w:val="20"/>
-          <w:szCs w:val="20"/>
-        </w:rPr>
-        <w:t>EDA (</w:t>
-      </w:r>
-      <w:proofErr w:type="spellStart"/>
-      <w:r>
-        <w:rPr>
-          <w:sz w:val="20"/>
-          <w:szCs w:val="20"/>
-        </w:rPr>
-        <w:t>Exploratory</w:t>
-      </w:r>
-      <w:proofErr w:type="spellEnd"/>
-      <w:r>
-        <w:rPr>
-          <w:sz w:val="20"/>
-          <w:szCs w:val="20"/>
-        </w:rPr>
-        <w:t xml:space="preserve"> Data </w:t>
-      </w:r>
-      <w:proofErr w:type="spellStart"/>
-      <w:r>
-        <w:rPr>
-          <w:sz w:val="20"/>
-          <w:szCs w:val="20"/>
-        </w:rPr>
-        <w:t>Analysis</w:t>
-      </w:r>
-      <w:proofErr w:type="spellEnd"/>
-      <w:r>
-        <w:rPr>
-          <w:sz w:val="20"/>
-          <w:szCs w:val="20"/>
-        </w:rPr>
-        <w:t>)</w:t>
+      <w:r>
+        <w:rPr>
+          <w:sz w:val="20"/>
+          <w:szCs w:val="20"/>
+        </w:rPr>
+        <w:t>Pandas-szal beolvassuk a CSV fájlt.</w:t>
+      </w:r>
+    </w:p>
+    <w:p>
+      <w:pPr>
+        <w:rPr>
+          <w:sz w:val="20"/>
+          <w:szCs w:val="20"/>
+        </w:rPr>
+      </w:pPr>
+      <w:r>
+        <w:rPr>
+          <w:sz w:val="20"/>
+          <w:szCs w:val="20"/>
+        </w:rPr>
+        <w:t>EDA (Exploratory Data Analysis)</w:t>
       </w:r>
     </w:p>
     <w:p>
@@ -221,37 +176,12 @@
           <w:szCs w:val="20"/>
         </w:rPr>
       </w:pPr>
-      <w:proofErr w:type="spellStart"/>
-      <w:r>
-        <w:rPr>
-          <w:sz w:val="20"/>
-          <w:szCs w:val="20"/>
-        </w:rPr>
-        <w:t>Törölt</w:t>
-      </w:r>
-      <w:proofErr w:type="spellEnd"/>
-      <w:r>
-        <w:rPr>
-          <w:sz w:val="20"/>
-          <w:szCs w:val="20"/>
-        </w:rPr>
-        <w:t xml:space="preserve"> (visszavont) számlák kiszűrése (</w:t>
-      </w:r>
-      <w:proofErr w:type="spellStart"/>
-      <w:r>
-        <w:rPr>
-          <w:sz w:val="20"/>
-          <w:szCs w:val="20"/>
-        </w:rPr>
-        <w:t>InvoiceNo</w:t>
-      </w:r>
-      <w:proofErr w:type="spellEnd"/>
-      <w:r>
-        <w:rPr>
-          <w:sz w:val="20"/>
-          <w:szCs w:val="20"/>
-        </w:rPr>
-        <w:t xml:space="preserve"> C-vel kezdődők)</w:t>
+      <w:r>
+        <w:rPr>
+          <w:sz w:val="20"/>
+          <w:szCs w:val="20"/>
+        </w:rPr>
+        <w:t>Törölt (visszavont) számlák kiszűrése (InvoiceNo C-vel kezdődők)</w:t>
       </w:r>
     </w:p>
     <w:p>
@@ -291,88 +221,22 @@
           <w:sz w:val="20"/>
           <w:szCs w:val="20"/>
         </w:rPr>
-        <w:t>Új „</w:t>
-      </w:r>
-      <w:proofErr w:type="spellStart"/>
-      <w:r>
-        <w:rPr>
-          <w:sz w:val="20"/>
-          <w:szCs w:val="20"/>
-        </w:rPr>
-        <w:t>TotalAmount</w:t>
-      </w:r>
-      <w:proofErr w:type="spellEnd"/>
-      <w:r>
-        <w:rPr>
-          <w:sz w:val="20"/>
-          <w:szCs w:val="20"/>
-        </w:rPr>
-        <w:t xml:space="preserve">” oszlop: </w:t>
-      </w:r>
-      <w:proofErr w:type="spellStart"/>
-      <w:r>
-        <w:rPr>
-          <w:sz w:val="20"/>
-          <w:szCs w:val="20"/>
-        </w:rPr>
-        <w:t>Quantity</w:t>
-      </w:r>
-      <w:proofErr w:type="spellEnd"/>
-      <w:r>
-        <w:rPr>
-          <w:sz w:val="20"/>
-          <w:szCs w:val="20"/>
-        </w:rPr>
-        <w:t xml:space="preserve"> × </w:t>
-      </w:r>
-      <w:proofErr w:type="spellStart"/>
-      <w:r>
-        <w:rPr>
-          <w:sz w:val="20"/>
-          <w:szCs w:val="20"/>
-        </w:rPr>
-        <w:t>UnitPrice</w:t>
-      </w:r>
-      <w:proofErr w:type="spellEnd"/>
-    </w:p>
-    <w:p>
-      <w:pPr>
-        <w:rPr>
-          <w:sz w:val="20"/>
-          <w:szCs w:val="20"/>
-        </w:rPr>
-      </w:pPr>
-      <w:proofErr w:type="spellStart"/>
-      <w:r>
-        <w:rPr>
-          <w:sz w:val="20"/>
-          <w:szCs w:val="20"/>
-        </w:rPr>
-        <w:t>Feature</w:t>
-      </w:r>
-      <w:proofErr w:type="spellEnd"/>
-      <w:r>
-        <w:rPr>
-          <w:sz w:val="20"/>
-          <w:szCs w:val="20"/>
-        </w:rPr>
-        <w:t xml:space="preserve"> </w:t>
-      </w:r>
-      <w:proofErr w:type="spellStart"/>
-      <w:r>
-        <w:rPr>
-          <w:sz w:val="20"/>
-          <w:szCs w:val="20"/>
-        </w:rPr>
-        <w:t>engineering</w:t>
-      </w:r>
-      <w:proofErr w:type="spellEnd"/>
-      <w:r>
-        <w:rPr>
-          <w:sz w:val="20"/>
-          <w:szCs w:val="20"/>
-        </w:rPr>
-        <w:t xml:space="preserve"> (RFM)</w:t>
+        <w:t>Új „TotalAmount” oszlop: Quantity × UnitPrice</w:t>
+      </w:r>
+    </w:p>
+    <w:p>
+      <w:pPr>
+        <w:rPr>
+          <w:sz w:val="20"/>
+          <w:szCs w:val="20"/>
+        </w:rPr>
+      </w:pPr>
+      <w:r>
+        <w:rPr>
+          <w:sz w:val="20"/>
+          <w:szCs w:val="20"/>
+        </w:rPr>
+        <w:t>Feature engineering (RFM)</w:t>
       </w:r>
     </w:p>
     <w:p>
@@ -387,21 +251,12 @@
           <w:szCs w:val="20"/>
         </w:rPr>
       </w:pPr>
-      <w:proofErr w:type="spellStart"/>
-      <w:r>
-        <w:rPr>
-          <w:sz w:val="20"/>
-          <w:szCs w:val="20"/>
-        </w:rPr>
-        <w:t>Recency</w:t>
-      </w:r>
-      <w:proofErr w:type="spellEnd"/>
-      <w:r>
-        <w:rPr>
-          <w:sz w:val="20"/>
-          <w:szCs w:val="20"/>
-        </w:rPr>
-        <w:t>: utolsó vásárlás óta eltelt napok</w:t>
+      <w:r>
+        <w:rPr>
+          <w:sz w:val="20"/>
+          <w:szCs w:val="20"/>
+        </w:rPr>
+        <w:t>Recency: utolsó vásárlás óta eltelt napok</w:t>
       </w:r>
     </w:p>
     <w:p>
@@ -416,21 +271,12 @@
           <w:szCs w:val="20"/>
         </w:rPr>
       </w:pPr>
-      <w:proofErr w:type="spellStart"/>
-      <w:r>
-        <w:rPr>
-          <w:sz w:val="20"/>
-          <w:szCs w:val="20"/>
-        </w:rPr>
-        <w:t>Frequency</w:t>
-      </w:r>
-      <w:proofErr w:type="spellEnd"/>
-      <w:r>
-        <w:rPr>
-          <w:sz w:val="20"/>
-          <w:szCs w:val="20"/>
-        </w:rPr>
-        <w:t>: vásárlások száma</w:t>
+      <w:r>
+        <w:rPr>
+          <w:sz w:val="20"/>
+          <w:szCs w:val="20"/>
+        </w:rPr>
+        <w:t>Frequency: vásárlások száma</w:t>
       </w:r>
     </w:p>
     <w:p>
@@ -445,21 +291,12 @@
           <w:szCs w:val="20"/>
         </w:rPr>
       </w:pPr>
-      <w:proofErr w:type="spellStart"/>
-      <w:r>
-        <w:rPr>
-          <w:sz w:val="20"/>
-          <w:szCs w:val="20"/>
-        </w:rPr>
-        <w:t>Monetary</w:t>
-      </w:r>
-      <w:proofErr w:type="spellEnd"/>
-      <w:r>
-        <w:rPr>
-          <w:sz w:val="20"/>
-          <w:szCs w:val="20"/>
-        </w:rPr>
-        <w:t>: összes költés</w:t>
+      <w:r>
+        <w:rPr>
+          <w:sz w:val="20"/>
+          <w:szCs w:val="20"/>
+        </w:rPr>
+        <w:t>Monetary: összes költés</w:t>
       </w:r>
     </w:p>
     <w:p>
@@ -514,39 +351,7 @@
           <w:sz w:val="20"/>
           <w:szCs w:val="20"/>
         </w:rPr>
-        <w:t>„</w:t>
-      </w:r>
-      <w:proofErr w:type="spellStart"/>
-      <w:r>
-        <w:rPr>
-          <w:sz w:val="20"/>
-          <w:szCs w:val="20"/>
-        </w:rPr>
-        <w:t>HighValue</w:t>
-      </w:r>
-      <w:proofErr w:type="spellEnd"/>
-      <w:r>
-        <w:rPr>
-          <w:sz w:val="20"/>
-          <w:szCs w:val="20"/>
-        </w:rPr>
-        <w:t xml:space="preserve">” címke: a </w:t>
-      </w:r>
-      <w:proofErr w:type="spellStart"/>
-      <w:r>
-        <w:rPr>
-          <w:sz w:val="20"/>
-          <w:szCs w:val="20"/>
-        </w:rPr>
-        <w:t>Monetary</w:t>
-      </w:r>
-      <w:proofErr w:type="spellEnd"/>
-      <w:r>
-        <w:rPr>
-          <w:sz w:val="20"/>
-          <w:szCs w:val="20"/>
-        </w:rPr>
-        <w:t xml:space="preserve"> medián felett van-e a költés</w:t>
+        <w:t>„HighValue” címke: a Monetary medián felett van-e a költés</w:t>
       </w:r>
     </w:p>
     <w:p>
@@ -561,79 +366,13 @@
           <w:szCs w:val="20"/>
         </w:rPr>
       </w:pPr>
-      <w:proofErr w:type="spellStart"/>
-      <w:r>
-        <w:rPr>
-          <w:sz w:val="20"/>
-          <w:szCs w:val="20"/>
-        </w:rPr>
-        <w:t>Train</w:t>
-      </w:r>
-      <w:proofErr w:type="spellEnd"/>
-      <w:r>
-        <w:rPr>
-          <w:sz w:val="20"/>
-          <w:szCs w:val="20"/>
-        </w:rPr>
-        <w:t xml:space="preserve">–test </w:t>
-      </w:r>
-      <w:proofErr w:type="spellStart"/>
-      <w:r>
-        <w:rPr>
-          <w:sz w:val="20"/>
-          <w:szCs w:val="20"/>
-        </w:rPr>
-        <w:t>split</w:t>
-      </w:r>
-      <w:proofErr w:type="spellEnd"/>
-      <w:r>
-        <w:rPr>
-          <w:sz w:val="20"/>
-          <w:szCs w:val="20"/>
-        </w:rPr>
-        <w:t xml:space="preserve">, </w:t>
-      </w:r>
-      <w:proofErr w:type="spellStart"/>
-      <w:r>
-        <w:rPr>
-          <w:sz w:val="20"/>
-          <w:szCs w:val="20"/>
-        </w:rPr>
-        <w:t>StandardScaler</w:t>
-      </w:r>
-      <w:proofErr w:type="spellEnd"/>
-      <w:r>
-        <w:rPr>
-          <w:sz w:val="20"/>
-          <w:szCs w:val="20"/>
-        </w:rPr>
-        <w:t xml:space="preserve"> + </w:t>
-      </w:r>
-      <w:proofErr w:type="spellStart"/>
-      <w:r>
-        <w:rPr>
-          <w:sz w:val="20"/>
-          <w:szCs w:val="20"/>
-        </w:rPr>
-        <w:t>LogisticRegression</w:t>
-      </w:r>
-      <w:proofErr w:type="spellEnd"/>
-      <w:r>
-        <w:rPr>
-          <w:sz w:val="20"/>
-          <w:szCs w:val="20"/>
-        </w:rPr>
-        <w:t xml:space="preserve"> </w:t>
-      </w:r>
-      <w:proofErr w:type="spellStart"/>
-      <w:r>
-        <w:rPr>
-          <w:sz w:val="20"/>
-          <w:szCs w:val="20"/>
-        </w:rPr>
-        <w:t>pipeline</w:t>
-      </w:r>
-      <w:proofErr w:type="spellEnd"/>
+      <w:r>
+        <w:rPr>
+          <w:sz w:val="20"/>
+          <w:szCs w:val="20"/>
+        </w:rPr>
+        <w:t>Train–test split, StandardScaler + LogisticRegression pipeline</w:t>
+      </w:r>
     </w:p>
     <w:p>
       <w:pPr>
@@ -667,23 +406,7 @@
           <w:sz w:val="20"/>
           <w:szCs w:val="20"/>
         </w:rPr>
-        <w:t>Nem felügyelt tanulás (</w:t>
-      </w:r>
-      <w:proofErr w:type="spellStart"/>
-      <w:r>
-        <w:rPr>
-          <w:sz w:val="20"/>
-          <w:szCs w:val="20"/>
-        </w:rPr>
-        <w:t>klaszterezés</w:t>
-      </w:r>
-      <w:proofErr w:type="spellEnd"/>
-      <w:r>
-        <w:rPr>
-          <w:sz w:val="20"/>
-          <w:szCs w:val="20"/>
-        </w:rPr>
-        <w:t>)</w:t>
+        <w:t>Nem felügyelt tanulás (klaszterezés)</w:t>
       </w:r>
     </w:p>
     <w:p>
@@ -718,21 +441,12 @@
           <w:szCs w:val="20"/>
         </w:rPr>
       </w:pPr>
-      <w:proofErr w:type="spellStart"/>
-      <w:r>
-        <w:rPr>
-          <w:sz w:val="20"/>
-          <w:szCs w:val="20"/>
-        </w:rPr>
-        <w:t>KMeans</w:t>
-      </w:r>
-      <w:proofErr w:type="spellEnd"/>
-      <w:r>
-        <w:rPr>
-          <w:sz w:val="20"/>
-          <w:szCs w:val="20"/>
-        </w:rPr>
-        <w:t xml:space="preserve"> 4 klaszterrel</w:t>
+      <w:r>
+        <w:rPr>
+          <w:sz w:val="20"/>
+          <w:szCs w:val="20"/>
+        </w:rPr>
+        <w:t>KMeans 4 klaszterrel</w:t>
       </w:r>
     </w:p>
     <w:p>
@@ -752,33 +466,8 @@
           <w:sz w:val="20"/>
           <w:szCs w:val="20"/>
         </w:rPr>
-        <w:t xml:space="preserve">Klaszterek vizualizációja </w:t>
-      </w:r>
-      <w:proofErr w:type="spellStart"/>
-      <w:r>
-        <w:rPr>
-          <w:sz w:val="20"/>
-          <w:szCs w:val="20"/>
-        </w:rPr>
-        <w:t>scatter</w:t>
-      </w:r>
-      <w:proofErr w:type="spellEnd"/>
-      <w:r>
-        <w:rPr>
-          <w:sz w:val="20"/>
-          <w:szCs w:val="20"/>
-        </w:rPr>
-        <w:t xml:space="preserve"> </w:t>
-      </w:r>
-      <w:proofErr w:type="spellStart"/>
-      <w:r>
-        <w:rPr>
-          <w:sz w:val="20"/>
-          <w:szCs w:val="20"/>
-        </w:rPr>
-        <w:t>ploton</w:t>
-      </w:r>
-      <w:proofErr w:type="spellEnd"/>
+        <w:t>Klaszterek vizualizációja scatter ploton</w:t>
+      </w:r>
     </w:p>
     <w:p>
       <w:pPr>
@@ -807,37 +496,12 @@
           <w:szCs w:val="20"/>
         </w:rPr>
       </w:pPr>
-      <w:proofErr w:type="spellStart"/>
-      <w:r>
-        <w:rPr>
-          <w:sz w:val="20"/>
-          <w:szCs w:val="20"/>
-        </w:rPr>
-        <w:t>IsolationForest</w:t>
-      </w:r>
-      <w:proofErr w:type="spellEnd"/>
-      <w:r>
-        <w:rPr>
-          <w:sz w:val="20"/>
-          <w:szCs w:val="20"/>
-        </w:rPr>
-        <w:t xml:space="preserve"> a tranzakciós „</w:t>
-      </w:r>
-      <w:proofErr w:type="spellStart"/>
-      <w:r>
-        <w:rPr>
-          <w:sz w:val="20"/>
-          <w:szCs w:val="20"/>
-        </w:rPr>
-        <w:t>TotalAmount</w:t>
-      </w:r>
-      <w:proofErr w:type="spellEnd"/>
-      <w:r>
-        <w:rPr>
-          <w:sz w:val="20"/>
-          <w:szCs w:val="20"/>
-        </w:rPr>
-        <w:t>” oszlopra</w:t>
+      <w:r>
+        <w:rPr>
+          <w:sz w:val="20"/>
+          <w:szCs w:val="20"/>
+        </w:rPr>
+        <w:t>IsolationForest a tranzakciós „TotalAmount” oszlopra</w:t>
       </w:r>
     </w:p>
     <w:p>
@@ -857,54 +521,22 @@
           <w:sz w:val="20"/>
           <w:szCs w:val="20"/>
         </w:rPr>
-        <w:t xml:space="preserve">Kiszűrt </w:t>
-      </w:r>
-      <w:proofErr w:type="spellStart"/>
-      <w:r>
-        <w:rPr>
-          <w:sz w:val="20"/>
-          <w:szCs w:val="20"/>
-        </w:rPr>
-        <w:t>outlierek</w:t>
-      </w:r>
-      <w:proofErr w:type="spellEnd"/>
-      <w:r>
-        <w:rPr>
-          <w:sz w:val="20"/>
-          <w:szCs w:val="20"/>
-        </w:rPr>
-        <w:t xml:space="preserve"> száma</w:t>
-      </w:r>
-    </w:p>
-    <w:p>
-      <w:pPr>
-        <w:rPr>
-          <w:sz w:val="20"/>
-          <w:szCs w:val="20"/>
-        </w:rPr>
-      </w:pPr>
-      <w:r>
-        <w:rPr>
-          <w:sz w:val="20"/>
-          <w:szCs w:val="20"/>
-        </w:rPr>
-        <w:t>Asszociációs szabályok (</w:t>
-      </w:r>
-      <w:proofErr w:type="spellStart"/>
-      <w:r>
-        <w:rPr>
-          <w:sz w:val="20"/>
-          <w:szCs w:val="20"/>
-        </w:rPr>
-        <w:t>cross-sell</w:t>
-      </w:r>
-      <w:proofErr w:type="spellEnd"/>
-      <w:r>
-        <w:rPr>
-          <w:sz w:val="20"/>
-          <w:szCs w:val="20"/>
-        </w:rPr>
-        <w:t xml:space="preserve"> ajánlás)</w:t>
+        <w:t>Kiszűrt outlierek száma</w:t>
+      </w:r>
+    </w:p>
+    <w:p>
+      <w:pPr>
+        <w:rPr>
+          <w:sz w:val="20"/>
+          <w:szCs w:val="20"/>
+        </w:rPr>
+      </w:pPr>
+      <w:r>
+        <w:rPr>
+          <w:sz w:val="20"/>
+          <w:szCs w:val="20"/>
+        </w:rPr>
+        <w:t>Asszociációs szabályok (cross-sell ajánlás)</w:t>
       </w:r>
     </w:p>
     <w:p>
@@ -924,17 +556,8 @@
           <w:sz w:val="20"/>
           <w:szCs w:val="20"/>
         </w:rPr>
-        <w:t xml:space="preserve">Egyes ország (például Egyesült Királyság) kosár-tranzakcióinak </w:t>
-      </w:r>
-      <w:proofErr w:type="spellStart"/>
-      <w:r>
-        <w:rPr>
-          <w:sz w:val="20"/>
-          <w:szCs w:val="20"/>
-        </w:rPr>
-        <w:t>binarizálása</w:t>
-      </w:r>
-      <w:proofErr w:type="spellEnd"/>
+        <w:t>Egyes ország (például Egyesült Királyság) kosár-tranzakcióinak binarizálása</w:t>
+      </w:r>
     </w:p>
     <w:p>
       <w:pPr>
@@ -953,17 +576,9 @@
           <w:sz w:val="20"/>
           <w:szCs w:val="20"/>
         </w:rPr>
-        <w:t xml:space="preserve">Apriori algoritmus minimum 2% </w:t>
-      </w:r>
-      <w:proofErr w:type="spellStart"/>
-      <w:r>
-        <w:rPr>
-          <w:sz w:val="20"/>
-          <w:szCs w:val="20"/>
-        </w:rPr>
-        <w:t>support-tal</w:t>
-      </w:r>
-      <w:proofErr w:type="spellEnd"/>
+        <w:lastRenderedPageBreak/>
+        <w:t>Apriori algoritmus minimum 2% support-tal</w:t>
+      </w:r>
     </w:p>
     <w:p>
       <w:pPr>
@@ -982,47 +597,22 @@
           <w:sz w:val="20"/>
           <w:szCs w:val="20"/>
         </w:rPr>
-        <w:t xml:space="preserve">Lift és </w:t>
-      </w:r>
-      <w:proofErr w:type="spellStart"/>
-      <w:r>
-        <w:rPr>
-          <w:sz w:val="20"/>
-          <w:szCs w:val="20"/>
-        </w:rPr>
-        <w:t>confidence</w:t>
-      </w:r>
-      <w:proofErr w:type="spellEnd"/>
-      <w:r>
-        <w:rPr>
-          <w:sz w:val="20"/>
-          <w:szCs w:val="20"/>
-        </w:rPr>
-        <w:t xml:space="preserve"> alapján legérdekesebb szabályok listázása</w:t>
-      </w:r>
-    </w:p>
-    <w:p>
-      <w:pPr>
-        <w:rPr>
-          <w:sz w:val="20"/>
-          <w:szCs w:val="20"/>
-        </w:rPr>
-      </w:pPr>
-      <w:proofErr w:type="spellStart"/>
-      <w:r>
-        <w:rPr>
-          <w:sz w:val="20"/>
-          <w:szCs w:val="20"/>
-        </w:rPr>
-        <w:t>Flask</w:t>
-      </w:r>
-      <w:proofErr w:type="spellEnd"/>
-      <w:r>
-        <w:rPr>
-          <w:sz w:val="20"/>
-          <w:szCs w:val="20"/>
-        </w:rPr>
-        <w:t xml:space="preserve"> REST API</w:t>
+        <w:t>Lift és confidence alapján legérdekesebb szabályok listázása</w:t>
+      </w:r>
+    </w:p>
+    <w:p>
+      <w:pPr>
+        <w:rPr>
+          <w:sz w:val="20"/>
+          <w:szCs w:val="20"/>
+        </w:rPr>
+      </w:pPr>
+      <w:r>
+        <w:rPr>
+          <w:sz w:val="20"/>
+          <w:szCs w:val="20"/>
+        </w:rPr>
+        <w:t>Flask REST API</w:t>
       </w:r>
     </w:p>
     <w:p>
@@ -1037,37 +627,12 @@
           <w:szCs w:val="20"/>
         </w:rPr>
       </w:pPr>
-      <w:proofErr w:type="spellStart"/>
-      <w:r>
-        <w:rPr>
-          <w:sz w:val="20"/>
-          <w:szCs w:val="20"/>
-        </w:rPr>
-        <w:t>Pipeline</w:t>
-      </w:r>
-      <w:proofErr w:type="spellEnd"/>
-      <w:r>
-        <w:rPr>
-          <w:sz w:val="20"/>
-          <w:szCs w:val="20"/>
-        </w:rPr>
-        <w:t xml:space="preserve"> alapú </w:t>
-      </w:r>
-      <w:proofErr w:type="spellStart"/>
-      <w:r>
-        <w:rPr>
-          <w:sz w:val="20"/>
-          <w:szCs w:val="20"/>
-        </w:rPr>
-        <w:t>predikciós</w:t>
-      </w:r>
-      <w:proofErr w:type="spellEnd"/>
-      <w:r>
-        <w:rPr>
-          <w:sz w:val="20"/>
-          <w:szCs w:val="20"/>
-        </w:rPr>
-        <w:t xml:space="preserve"> REST-végpont</w:t>
+      <w:r>
+        <w:rPr>
+          <w:sz w:val="20"/>
+          <w:szCs w:val="20"/>
+        </w:rPr>
+        <w:t>Pipeline alapú predikciós REST-végpont</w:t>
       </w:r>
     </w:p>
     <w:p/>
@@ -1076,29 +641,12 @@
         <w:pStyle w:val="Cmsor2"/>
       </w:pPr>
       <w:r>
-        <w:lastRenderedPageBreak/>
         <w:t>Eredmények:</w:t>
       </w:r>
     </w:p>
     <w:p>
       <w:r>
-        <w:t xml:space="preserve">RFM </w:t>
-      </w:r>
-      <w:proofErr w:type="spellStart"/>
-      <w:r>
-        <w:t>Clusters</w:t>
-      </w:r>
-      <w:proofErr w:type="spellEnd"/>
-      <w:r>
-        <w:t xml:space="preserve"> - </w:t>
-      </w:r>
-      <w:proofErr w:type="spellStart"/>
-      <w:r>
-        <w:t>Monetary</w:t>
-      </w:r>
-      <w:proofErr w:type="spellEnd"/>
-      <w:r>
-        <w:t xml:space="preserve"> </w:t>
+        <w:t xml:space="preserve">RFM Clusters - Monetary </w:t>
       </w:r>
       <w:r>
         <w:t>–</w:t>
@@ -1109,11 +657,9 @@
       <w:r>
         <w:t xml:space="preserve">.png mutatja a </w:t>
       </w:r>
-      <w:proofErr w:type="spellStart"/>
       <w:r>
         <w:t>train_unsupervised_model</w:t>
       </w:r>
-      <w:proofErr w:type="spellEnd"/>
       <w:r>
         <w:t xml:space="preserve"> függvény eredményét.</w:t>
       </w:r>
@@ -1128,11 +674,9 @@
       <w:r>
         <w:t xml:space="preserve"> (Sajnos látható benne pár </w:t>
       </w:r>
-      <w:proofErr w:type="spellStart"/>
       <w:r>
         <w:t>DeprecationWarning</w:t>
       </w:r>
-      <w:proofErr w:type="spellEnd"/>
       <w:r>
         <w:t>, amit nem tudtam kiszedni)</w:t>
       </w:r>
@@ -1145,156 +689,43 @@
         <w:t>--</w:t>
       </w:r>
       <w:r>
-        <w:t xml:space="preserve"> </w:t>
-      </w:r>
-      <w:proofErr w:type="spellStart"/>
-      <w:r>
-        <w:t>serve</w:t>
-      </w:r>
-      <w:proofErr w:type="spellEnd"/>
-      <w:r>
-        <w:t xml:space="preserve"> </w:t>
-      </w:r>
-      <w:r>
-        <w:t xml:space="preserve">paraméterrel indítjuk az </w:t>
-      </w:r>
-      <w:proofErr w:type="spellStart"/>
-      <w:r>
-        <w:t>alkamazást</w:t>
-      </w:r>
-      <w:proofErr w:type="spellEnd"/>
-      <w:r>
-        <w:t xml:space="preserve">, akkor </w:t>
+        <w:t xml:space="preserve"> serve </w:t>
+      </w:r>
+      <w:r>
+        <w:t xml:space="preserve">paraméterrel indítjuk az alkamazást, akkor </w:t>
       </w:r>
       <w:r>
         <w:t>REST API is tesztelhető:</w:t>
       </w:r>
     </w:p>
     <w:p>
-      <w:proofErr w:type="spellStart"/>
       <w:r>
         <w:rPr>
           <w:i/>
           <w:iCs/>
         </w:rPr>
-        <w:t>python</w:t>
-      </w:r>
-      <w:proofErr w:type="spellEnd"/>
-      <w:r>
-        <w:rPr>
-          <w:i/>
-          <w:iCs/>
-        </w:rPr>
-        <w:t xml:space="preserve"> online_retail_workshop.py --</w:t>
-      </w:r>
-      <w:proofErr w:type="spellStart"/>
-      <w:r>
-        <w:rPr>
-          <w:i/>
-          <w:iCs/>
-        </w:rPr>
-        <w:t>serve</w:t>
-      </w:r>
-      <w:proofErr w:type="spellEnd"/>
-    </w:p>
-    <w:p>
-      <w:proofErr w:type="spellStart"/>
-      <w:r>
-        <w:t>curl</w:t>
-      </w:r>
-      <w:proofErr w:type="spellEnd"/>
-      <w:r>
-        <w:t xml:space="preserve"> parancsból a legegyszerűbb meghívni:</w:t>
+        <w:t>python online_retail_workshop.py --serve</w:t>
+      </w:r>
+    </w:p>
+    <w:p>
+      <w:r>
+        <w:t>curl parancsból a legegyszerűbb meghívni:</w:t>
       </w:r>
       <w:r>
         <w:br/>
       </w:r>
-      <w:proofErr w:type="spellStart"/>
-      <w:r>
-        <w:t>curl</w:t>
-      </w:r>
-      <w:proofErr w:type="spellEnd"/>
-      <w:r>
-        <w:t xml:space="preserve"> --</w:t>
-      </w:r>
-      <w:proofErr w:type="spellStart"/>
-      <w:r>
-        <w:t>location</w:t>
-      </w:r>
-      <w:proofErr w:type="spellEnd"/>
-      <w:r>
-        <w:t xml:space="preserve"> 'http://127.0.0.1:5000/</w:t>
-      </w:r>
-      <w:proofErr w:type="spellStart"/>
-      <w:r>
-        <w:t>predict</w:t>
-      </w:r>
-      <w:proofErr w:type="spellEnd"/>
-      <w:r>
-        <w:t>' --</w:t>
-      </w:r>
-      <w:proofErr w:type="spellStart"/>
-      <w:r>
-        <w:t>header</w:t>
-      </w:r>
-      <w:proofErr w:type="spellEnd"/>
-      <w:r>
-        <w:t xml:space="preserve"> '</w:t>
-      </w:r>
-      <w:proofErr w:type="spellStart"/>
-      <w:r>
-        <w:t>Content-Type</w:t>
-      </w:r>
-      <w:proofErr w:type="spellEnd"/>
-      <w:r>
-        <w:t xml:space="preserve">: </w:t>
-      </w:r>
-      <w:proofErr w:type="spellStart"/>
-      <w:r>
-        <w:t>application</w:t>
-      </w:r>
-      <w:proofErr w:type="spellEnd"/>
-      <w:r>
-        <w:t>/</w:t>
-      </w:r>
-      <w:proofErr w:type="spellStart"/>
-      <w:r>
-        <w:t>json</w:t>
-      </w:r>
-      <w:proofErr w:type="spellEnd"/>
-      <w:r>
-        <w:t>' --</w:t>
-      </w:r>
-      <w:proofErr w:type="spellStart"/>
-      <w:r>
-        <w:t>data</w:t>
-      </w:r>
-      <w:proofErr w:type="spellEnd"/>
-      <w:r>
-        <w:t xml:space="preserve"> '[{"Recency":10,"Frequency":5,"Monetary":250}]'</w:t>
-      </w:r>
-    </w:p>
-    <w:p>
-      <w:r>
-        <w:t xml:space="preserve">De én postmannel teszteltem, postman </w:t>
-      </w:r>
-      <w:proofErr w:type="spellStart"/>
-      <w:r>
-        <w:t>collectiont</w:t>
-      </w:r>
-      <w:proofErr w:type="spellEnd"/>
-      <w:r>
-        <w:t xml:space="preserve"> is csatolom.</w:t>
-      </w:r>
-    </w:p>
-    <w:p>
-      <w:proofErr w:type="spellStart"/>
-      <w:r>
-        <w:t>json</w:t>
-      </w:r>
-      <w:proofErr w:type="spellEnd"/>
-      <w:r>
-        <w:t xml:space="preserve"> body-t ide is bemásolom egy kis elemzéssel.</w:t>
+      <w:r>
+        <w:t>curl --location 'http://127.0.0.1:5000/predict' --header 'Content-Type: application/json' --data '[{"Recency":10,"Frequency":5,"Monetary":250}]'</w:t>
+      </w:r>
+    </w:p>
+    <w:p>
+      <w:r>
+        <w:t>De én postmannel teszteltem, postman collectiont is csatolom.</w:t>
+      </w:r>
+    </w:p>
+    <w:p>
+      <w:r>
+        <w:t>json body-t ide is bemásolom egy kis elemzéssel.</w:t>
       </w:r>
     </w:p>
     <w:p>
@@ -1320,49 +751,46 @@
         <w:rPr>
           <w:rFonts w:ascii="Agency FB" w:hAnsi="Agency FB"/>
         </w:rPr>
-        <w:t>  {"</w:t>
-      </w:r>
-      <w:proofErr w:type="spellStart"/>
-      <w:r>
+        <w:t>  {"Recency": 5, "Frequency": 20, "Monetary": 1500.0},</w:t>
+      </w:r>
+    </w:p>
+    <w:p>
+      <w:pPr>
         <w:rPr>
           <w:rFonts w:ascii="Agency FB" w:hAnsi="Agency FB"/>
         </w:rPr>
-        <w:t>Recency</w:t>
-      </w:r>
-      <w:proofErr w:type="spellEnd"/>
+      </w:pPr>
       <w:r>
         <w:rPr>
           <w:rFonts w:ascii="Agency FB" w:hAnsi="Agency FB"/>
         </w:rPr>
-        <w:t>": 5, "</w:t>
-      </w:r>
-      <w:proofErr w:type="spellStart"/>
-      <w:r>
+        <w:t>  {"Recency": 30, "Frequency": 5, "Monetary": 200.0},</w:t>
+      </w:r>
+    </w:p>
+    <w:p>
+      <w:pPr>
         <w:rPr>
           <w:rFonts w:ascii="Agency FB" w:hAnsi="Agency FB"/>
         </w:rPr>
-        <w:t>Frequency</w:t>
-      </w:r>
-      <w:proofErr w:type="spellEnd"/>
+      </w:pPr>
       <w:r>
         <w:rPr>
           <w:rFonts w:ascii="Agency FB" w:hAnsi="Agency FB"/>
         </w:rPr>
-        <w:t>": 20, "</w:t>
-      </w:r>
-      <w:proofErr w:type="spellStart"/>
-      <w:r>
+        <w:t>  {"Recency": 60, "Frequency": 2, "Monetary": 50.0},</w:t>
+      </w:r>
+    </w:p>
+    <w:p>
+      <w:pPr>
         <w:rPr>
           <w:rFonts w:ascii="Agency FB" w:hAnsi="Agency FB"/>
         </w:rPr>
-        <w:t>Monetary</w:t>
-      </w:r>
-      <w:proofErr w:type="spellEnd"/>
+      </w:pPr>
       <w:r>
         <w:rPr>
           <w:rFonts w:ascii="Agency FB" w:hAnsi="Agency FB"/>
         </w:rPr>
-        <w:t>": 1500.0},</w:t>
+        <w:t>  {"Recency": 10, "Frequency": 10, "Monetary": 800.0},</w:t>
       </w:r>
     </w:p>
     <w:p>
@@ -1375,49 +803,46 @@
         <w:rPr>
           <w:rFonts w:ascii="Agency FB" w:hAnsi="Agency FB"/>
         </w:rPr>
-        <w:t>  {"</w:t>
-      </w:r>
-      <w:proofErr w:type="spellStart"/>
-      <w:r>
+        <w:t>  {"Recency": 90, "Frequency": 1, "Monetary": 20.0},</w:t>
+      </w:r>
+    </w:p>
+    <w:p>
+      <w:pPr>
         <w:rPr>
           <w:rFonts w:ascii="Agency FB" w:hAnsi="Agency FB"/>
         </w:rPr>
-        <w:t>Recency</w:t>
-      </w:r>
-      <w:proofErr w:type="spellEnd"/>
+      </w:pPr>
       <w:r>
         <w:rPr>
           <w:rFonts w:ascii="Agency FB" w:hAnsi="Agency FB"/>
         </w:rPr>
-        <w:t>": 30, "</w:t>
-      </w:r>
-      <w:proofErr w:type="spellStart"/>
-      <w:r>
+        <w:t>  {"Recency": 15, "Frequency": 8, "Monetary": 600.0},</w:t>
+      </w:r>
+    </w:p>
+    <w:p>
+      <w:pPr>
         <w:rPr>
           <w:rFonts w:ascii="Agency FB" w:hAnsi="Agency FB"/>
         </w:rPr>
-        <w:t>Frequency</w:t>
-      </w:r>
-      <w:proofErr w:type="spellEnd"/>
+      </w:pPr>
       <w:r>
         <w:rPr>
           <w:rFonts w:ascii="Agency FB" w:hAnsi="Agency FB"/>
         </w:rPr>
-        <w:t>": 5, "</w:t>
-      </w:r>
-      <w:proofErr w:type="spellStart"/>
-      <w:r>
+        <w:t>  {"Recency": 45, "Frequency": 3, "Monetary": 120.0},</w:t>
+      </w:r>
+    </w:p>
+    <w:p>
+      <w:pPr>
         <w:rPr>
           <w:rFonts w:ascii="Agency FB" w:hAnsi="Agency FB"/>
         </w:rPr>
-        <w:t>Monetary</w:t>
-      </w:r>
-      <w:proofErr w:type="spellEnd"/>
+      </w:pPr>
       <w:r>
         <w:rPr>
           <w:rFonts w:ascii="Agency FB" w:hAnsi="Agency FB"/>
         </w:rPr>
-        <w:t>": 200.0},</w:t>
+        <w:t>  {"Recency": 2, "Frequency": 25, "Monetary": 2000.0},</w:t>
       </w:r>
     </w:p>
     <w:p>
@@ -1430,446 +855,32 @@
         <w:rPr>
           <w:rFonts w:ascii="Agency FB" w:hAnsi="Agency FB"/>
         </w:rPr>
-        <w:t>  {"</w:t>
-      </w:r>
-      <w:proofErr w:type="spellStart"/>
-      <w:r>
+        <w:t>  {"Recency": 75, "Frequency": 4, "Monetary": 300.0},</w:t>
+      </w:r>
+    </w:p>
+    <w:p>
+      <w:pPr>
         <w:rPr>
           <w:rFonts w:ascii="Agency FB" w:hAnsi="Agency FB"/>
         </w:rPr>
-        <w:t>Recency</w:t>
-      </w:r>
-      <w:proofErr w:type="spellEnd"/>
+      </w:pPr>
       <w:r>
         <w:rPr>
           <w:rFonts w:ascii="Agency FB" w:hAnsi="Agency FB"/>
         </w:rPr>
-        <w:t>": 60, "</w:t>
-      </w:r>
-      <w:proofErr w:type="spellStart"/>
-      <w:r>
+        <w:t>  {"Recency": 20, "Frequency": 12, "Monetary": 1000.0}</w:t>
+      </w:r>
+    </w:p>
+    <w:p>
+      <w:pPr>
         <w:rPr>
           <w:rFonts w:ascii="Agency FB" w:hAnsi="Agency FB"/>
         </w:rPr>
-        <w:t>Frequency</w:t>
-      </w:r>
-      <w:proofErr w:type="spellEnd"/>
+      </w:pPr>
       <w:r>
         <w:rPr>
           <w:rFonts w:ascii="Agency FB" w:hAnsi="Agency FB"/>
         </w:rPr>
-        <w:t>": 2, "</w:t>
-      </w:r>
-      <w:proofErr w:type="spellStart"/>
-      <w:r>
-        <w:rPr>
-          <w:rFonts w:ascii="Agency FB" w:hAnsi="Agency FB"/>
-        </w:rPr>
-        <w:t>Monetary</w:t>
-      </w:r>
-      <w:proofErr w:type="spellEnd"/>
-      <w:r>
-        <w:rPr>
-          <w:rFonts w:ascii="Agency FB" w:hAnsi="Agency FB"/>
-        </w:rPr>
-        <w:t>": 50.0},</w:t>
-      </w:r>
-    </w:p>
-    <w:p>
-      <w:pPr>
-        <w:rPr>
-          <w:rFonts w:ascii="Agency FB" w:hAnsi="Agency FB"/>
-        </w:rPr>
-      </w:pPr>
-      <w:r>
-        <w:rPr>
-          <w:rFonts w:ascii="Agency FB" w:hAnsi="Agency FB"/>
-        </w:rPr>
-        <w:t>  {"</w:t>
-      </w:r>
-      <w:proofErr w:type="spellStart"/>
-      <w:r>
-        <w:rPr>
-          <w:rFonts w:ascii="Agency FB" w:hAnsi="Agency FB"/>
-        </w:rPr>
-        <w:t>Recency</w:t>
-      </w:r>
-      <w:proofErr w:type="spellEnd"/>
-      <w:r>
-        <w:rPr>
-          <w:rFonts w:ascii="Agency FB" w:hAnsi="Agency FB"/>
-        </w:rPr>
-        <w:t>": 10, "</w:t>
-      </w:r>
-      <w:proofErr w:type="spellStart"/>
-      <w:r>
-        <w:rPr>
-          <w:rFonts w:ascii="Agency FB" w:hAnsi="Agency FB"/>
-        </w:rPr>
-        <w:t>Frequency</w:t>
-      </w:r>
-      <w:proofErr w:type="spellEnd"/>
-      <w:r>
-        <w:rPr>
-          <w:rFonts w:ascii="Agency FB" w:hAnsi="Agency FB"/>
-        </w:rPr>
-        <w:t>": 10, "</w:t>
-      </w:r>
-      <w:proofErr w:type="spellStart"/>
-      <w:r>
-        <w:rPr>
-          <w:rFonts w:ascii="Agency FB" w:hAnsi="Agency FB"/>
-        </w:rPr>
-        <w:t>Monetary</w:t>
-      </w:r>
-      <w:proofErr w:type="spellEnd"/>
-      <w:r>
-        <w:rPr>
-          <w:rFonts w:ascii="Agency FB" w:hAnsi="Agency FB"/>
-        </w:rPr>
-        <w:t>": 800.0},</w:t>
-      </w:r>
-    </w:p>
-    <w:p>
-      <w:pPr>
-        <w:rPr>
-          <w:rFonts w:ascii="Agency FB" w:hAnsi="Agency FB"/>
-        </w:rPr>
-      </w:pPr>
-      <w:r>
-        <w:rPr>
-          <w:rFonts w:ascii="Agency FB" w:hAnsi="Agency FB"/>
-        </w:rPr>
-        <w:t>  {"</w:t>
-      </w:r>
-      <w:proofErr w:type="spellStart"/>
-      <w:r>
-        <w:rPr>
-          <w:rFonts w:ascii="Agency FB" w:hAnsi="Agency FB"/>
-        </w:rPr>
-        <w:t>Recency</w:t>
-      </w:r>
-      <w:proofErr w:type="spellEnd"/>
-      <w:r>
-        <w:rPr>
-          <w:rFonts w:ascii="Agency FB" w:hAnsi="Agency FB"/>
-        </w:rPr>
-        <w:t>": 90, "</w:t>
-      </w:r>
-      <w:proofErr w:type="spellStart"/>
-      <w:r>
-        <w:rPr>
-          <w:rFonts w:ascii="Agency FB" w:hAnsi="Agency FB"/>
-        </w:rPr>
-        <w:t>Frequency</w:t>
-      </w:r>
-      <w:proofErr w:type="spellEnd"/>
-      <w:r>
-        <w:rPr>
-          <w:rFonts w:ascii="Agency FB" w:hAnsi="Agency FB"/>
-        </w:rPr>
-        <w:t>": 1, "</w:t>
-      </w:r>
-      <w:proofErr w:type="spellStart"/>
-      <w:r>
-        <w:rPr>
-          <w:rFonts w:ascii="Agency FB" w:hAnsi="Agency FB"/>
-        </w:rPr>
-        <w:t>Monetary</w:t>
-      </w:r>
-      <w:proofErr w:type="spellEnd"/>
-      <w:r>
-        <w:rPr>
-          <w:rFonts w:ascii="Agency FB" w:hAnsi="Agency FB"/>
-        </w:rPr>
-        <w:t>": 20.0},</w:t>
-      </w:r>
-    </w:p>
-    <w:p>
-      <w:pPr>
-        <w:rPr>
-          <w:rFonts w:ascii="Agency FB" w:hAnsi="Agency FB"/>
-        </w:rPr>
-      </w:pPr>
-      <w:r>
-        <w:rPr>
-          <w:rFonts w:ascii="Agency FB" w:hAnsi="Agency FB"/>
-        </w:rPr>
-        <w:t>  {"</w:t>
-      </w:r>
-      <w:proofErr w:type="spellStart"/>
-      <w:r>
-        <w:rPr>
-          <w:rFonts w:ascii="Agency FB" w:hAnsi="Agency FB"/>
-        </w:rPr>
-        <w:t>Recency</w:t>
-      </w:r>
-      <w:proofErr w:type="spellEnd"/>
-      <w:r>
-        <w:rPr>
-          <w:rFonts w:ascii="Agency FB" w:hAnsi="Agency FB"/>
-        </w:rPr>
-        <w:t>": 15, "</w:t>
-      </w:r>
-      <w:proofErr w:type="spellStart"/>
-      <w:r>
-        <w:rPr>
-          <w:rFonts w:ascii="Agency FB" w:hAnsi="Agency FB"/>
-        </w:rPr>
-        <w:t>Frequency</w:t>
-      </w:r>
-      <w:proofErr w:type="spellEnd"/>
-      <w:r>
-        <w:rPr>
-          <w:rFonts w:ascii="Agency FB" w:hAnsi="Agency FB"/>
-        </w:rPr>
-        <w:t>": 8, "</w:t>
-      </w:r>
-      <w:proofErr w:type="spellStart"/>
-      <w:r>
-        <w:rPr>
-          <w:rFonts w:ascii="Agency FB" w:hAnsi="Agency FB"/>
-        </w:rPr>
-        <w:t>Monetary</w:t>
-      </w:r>
-      <w:proofErr w:type="spellEnd"/>
-      <w:r>
-        <w:rPr>
-          <w:rFonts w:ascii="Agency FB" w:hAnsi="Agency FB"/>
-        </w:rPr>
-        <w:t>": 600.0},</w:t>
-      </w:r>
-    </w:p>
-    <w:p>
-      <w:pPr>
-        <w:rPr>
-          <w:rFonts w:ascii="Agency FB" w:hAnsi="Agency FB"/>
-        </w:rPr>
-      </w:pPr>
-      <w:r>
-        <w:rPr>
-          <w:rFonts w:ascii="Agency FB" w:hAnsi="Agency FB"/>
-        </w:rPr>
-        <w:t>  {"</w:t>
-      </w:r>
-      <w:proofErr w:type="spellStart"/>
-      <w:r>
-        <w:rPr>
-          <w:rFonts w:ascii="Agency FB" w:hAnsi="Agency FB"/>
-        </w:rPr>
-        <w:t>Recency</w:t>
-      </w:r>
-      <w:proofErr w:type="spellEnd"/>
-      <w:r>
-        <w:rPr>
-          <w:rFonts w:ascii="Agency FB" w:hAnsi="Agency FB"/>
-        </w:rPr>
-        <w:t>": 45, "</w:t>
-      </w:r>
-      <w:proofErr w:type="spellStart"/>
-      <w:r>
-        <w:rPr>
-          <w:rFonts w:ascii="Agency FB" w:hAnsi="Agency FB"/>
-        </w:rPr>
-        <w:t>Frequency</w:t>
-      </w:r>
-      <w:proofErr w:type="spellEnd"/>
-      <w:r>
-        <w:rPr>
-          <w:rFonts w:ascii="Agency FB" w:hAnsi="Agency FB"/>
-        </w:rPr>
-        <w:t>": 3, "</w:t>
-      </w:r>
-      <w:proofErr w:type="spellStart"/>
-      <w:r>
-        <w:rPr>
-          <w:rFonts w:ascii="Agency FB" w:hAnsi="Agency FB"/>
-        </w:rPr>
-        <w:t>Monetary</w:t>
-      </w:r>
-      <w:proofErr w:type="spellEnd"/>
-      <w:r>
-        <w:rPr>
-          <w:rFonts w:ascii="Agency FB" w:hAnsi="Agency FB"/>
-        </w:rPr>
-        <w:t>": 120.0},</w:t>
-      </w:r>
-    </w:p>
-    <w:p>
-      <w:pPr>
-        <w:rPr>
-          <w:rFonts w:ascii="Agency FB" w:hAnsi="Agency FB"/>
-        </w:rPr>
-      </w:pPr>
-      <w:r>
-        <w:rPr>
-          <w:rFonts w:ascii="Agency FB" w:hAnsi="Agency FB"/>
-        </w:rPr>
-        <w:t>  {"</w:t>
-      </w:r>
-      <w:proofErr w:type="spellStart"/>
-      <w:r>
-        <w:rPr>
-          <w:rFonts w:ascii="Agency FB" w:hAnsi="Agency FB"/>
-        </w:rPr>
-        <w:t>Recency</w:t>
-      </w:r>
-      <w:proofErr w:type="spellEnd"/>
-      <w:r>
-        <w:rPr>
-          <w:rFonts w:ascii="Agency FB" w:hAnsi="Agency FB"/>
-        </w:rPr>
-        <w:t>": 2, "</w:t>
-      </w:r>
-      <w:proofErr w:type="spellStart"/>
-      <w:r>
-        <w:rPr>
-          <w:rFonts w:ascii="Agency FB" w:hAnsi="Agency FB"/>
-        </w:rPr>
-        <w:t>Frequency</w:t>
-      </w:r>
-      <w:proofErr w:type="spellEnd"/>
-      <w:r>
-        <w:rPr>
-          <w:rFonts w:ascii="Agency FB" w:hAnsi="Agency FB"/>
-        </w:rPr>
-        <w:t>": 25, "</w:t>
-      </w:r>
-      <w:proofErr w:type="spellStart"/>
-      <w:r>
-        <w:rPr>
-          <w:rFonts w:ascii="Agency FB" w:hAnsi="Agency FB"/>
-        </w:rPr>
-        <w:t>Monetary</w:t>
-      </w:r>
-      <w:proofErr w:type="spellEnd"/>
-      <w:r>
-        <w:rPr>
-          <w:rFonts w:ascii="Agency FB" w:hAnsi="Agency FB"/>
-        </w:rPr>
-        <w:t>": 2000.0},</w:t>
-      </w:r>
-    </w:p>
-    <w:p>
-      <w:pPr>
-        <w:rPr>
-          <w:rFonts w:ascii="Agency FB" w:hAnsi="Agency FB"/>
-        </w:rPr>
-      </w:pPr>
-      <w:r>
-        <w:rPr>
-          <w:rFonts w:ascii="Agency FB" w:hAnsi="Agency FB"/>
-        </w:rPr>
-        <w:t>  {"</w:t>
-      </w:r>
-      <w:proofErr w:type="spellStart"/>
-      <w:r>
-        <w:rPr>
-          <w:rFonts w:ascii="Agency FB" w:hAnsi="Agency FB"/>
-        </w:rPr>
-        <w:t>Recency</w:t>
-      </w:r>
-      <w:proofErr w:type="spellEnd"/>
-      <w:r>
-        <w:rPr>
-          <w:rFonts w:ascii="Agency FB" w:hAnsi="Agency FB"/>
-        </w:rPr>
-        <w:t>": 75, "</w:t>
-      </w:r>
-      <w:proofErr w:type="spellStart"/>
-      <w:r>
-        <w:rPr>
-          <w:rFonts w:ascii="Agency FB" w:hAnsi="Agency FB"/>
-        </w:rPr>
-        <w:t>Frequency</w:t>
-      </w:r>
-      <w:proofErr w:type="spellEnd"/>
-      <w:r>
-        <w:rPr>
-          <w:rFonts w:ascii="Agency FB" w:hAnsi="Agency FB"/>
-        </w:rPr>
-        <w:t>": 4, "</w:t>
-      </w:r>
-      <w:proofErr w:type="spellStart"/>
-      <w:r>
-        <w:rPr>
-          <w:rFonts w:ascii="Agency FB" w:hAnsi="Agency FB"/>
-        </w:rPr>
-        <w:t>Monetary</w:t>
-      </w:r>
-      <w:proofErr w:type="spellEnd"/>
-      <w:r>
-        <w:rPr>
-          <w:rFonts w:ascii="Agency FB" w:hAnsi="Agency FB"/>
-        </w:rPr>
-        <w:t>": 300.0},</w:t>
-      </w:r>
-    </w:p>
-    <w:p>
-      <w:pPr>
-        <w:rPr>
-          <w:rFonts w:ascii="Agency FB" w:hAnsi="Agency FB"/>
-        </w:rPr>
-      </w:pPr>
-      <w:r>
-        <w:rPr>
-          <w:rFonts w:ascii="Agency FB" w:hAnsi="Agency FB"/>
-        </w:rPr>
-        <w:t>  {"</w:t>
-      </w:r>
-      <w:proofErr w:type="spellStart"/>
-      <w:r>
-        <w:rPr>
-          <w:rFonts w:ascii="Agency FB" w:hAnsi="Agency FB"/>
-        </w:rPr>
-        <w:t>Recency</w:t>
-      </w:r>
-      <w:proofErr w:type="spellEnd"/>
-      <w:r>
-        <w:rPr>
-          <w:rFonts w:ascii="Agency FB" w:hAnsi="Agency FB"/>
-        </w:rPr>
-        <w:t>": 20, "</w:t>
-      </w:r>
-      <w:proofErr w:type="spellStart"/>
-      <w:r>
-        <w:rPr>
-          <w:rFonts w:ascii="Agency FB" w:hAnsi="Agency FB"/>
-        </w:rPr>
-        <w:t>Frequency</w:t>
-      </w:r>
-      <w:proofErr w:type="spellEnd"/>
-      <w:r>
-        <w:rPr>
-          <w:rFonts w:ascii="Agency FB" w:hAnsi="Agency FB"/>
-        </w:rPr>
-        <w:t>": 12, "</w:t>
-      </w:r>
-      <w:proofErr w:type="spellStart"/>
-      <w:r>
-        <w:rPr>
-          <w:rFonts w:ascii="Agency FB" w:hAnsi="Agency FB"/>
-        </w:rPr>
-        <w:t>Monetary</w:t>
-      </w:r>
-      <w:proofErr w:type="spellEnd"/>
-      <w:r>
-        <w:rPr>
-          <w:rFonts w:ascii="Agency FB" w:hAnsi="Agency FB"/>
-        </w:rPr>
-        <w:t>": 1000.0}</w:t>
-      </w:r>
-    </w:p>
-    <w:p>
-      <w:pPr>
-        <w:rPr>
-          <w:rFonts w:ascii="Agency FB" w:hAnsi="Agency FB"/>
-        </w:rPr>
-      </w:pPr>
-      <w:r>
-        <w:rPr>
-          <w:rFonts w:ascii="Agency FB" w:hAnsi="Agency FB"/>
-        </w:rPr>
         <w:t>]</w:t>
       </w:r>
     </w:p>
@@ -1884,95 +895,29 @@
         <w:t xml:space="preserve">, </w:t>
       </w:r>
       <w:r>
-        <w:t xml:space="preserve">10 minta 1-es </w:t>
-      </w:r>
-      <w:proofErr w:type="spellStart"/>
-      <w:r>
-        <w:t>predikciót</w:t>
-      </w:r>
-      <w:proofErr w:type="spellEnd"/>
-      <w:r>
-        <w:t xml:space="preserve"> kapott, tehát magas értékű ügyfélként lett minősítve. Ezeknél jellemzően magasabb a tranzakciós összérték (</w:t>
-      </w:r>
-      <w:proofErr w:type="spellStart"/>
-      <w:r>
-        <w:t>Monetary</w:t>
-      </w:r>
-      <w:proofErr w:type="spellEnd"/>
-      <w:r>
-        <w:t>), illetve nagyobb a vásárlási gyakoriság (</w:t>
-      </w:r>
-      <w:proofErr w:type="spellStart"/>
-      <w:r>
-        <w:t>Frequency</w:t>
-      </w:r>
-      <w:proofErr w:type="spellEnd"/>
-      <w:r>
-        <w:t xml:space="preserve">), és általában frissebb a legutóbbi vásárlás (alacsony </w:t>
-      </w:r>
-      <w:proofErr w:type="spellStart"/>
-      <w:r>
-        <w:t>Recency</w:t>
-      </w:r>
-      <w:proofErr w:type="spellEnd"/>
-      <w:r>
-        <w:t>).</w:t>
-      </w:r>
-    </w:p>
-    <w:p>
-      <w:r>
-        <w:t xml:space="preserve">• A 3, 5, 7 és 9 minta 0-ás </w:t>
-      </w:r>
-      <w:proofErr w:type="spellStart"/>
-      <w:r>
-        <w:t>predikciót</w:t>
-      </w:r>
-      <w:proofErr w:type="spellEnd"/>
-      <w:r>
-        <w:t xml:space="preserve"> kapott, tehát alacsony értékű ügyfélként lett besorolva. Ezeknél alacsony a tranzakciós összérték, ritkább a vásárlás, vagy régebbi az utolsó vásárlás időpontja.</w:t>
-      </w:r>
-    </w:p>
-    <w:p>
+        <w:t xml:space="preserve">10 minta 1-es predikciót kapott, tehát magas értékű ügyfélként lett minősítve. Ezeknél jellemzően magasabb a tranzakciós összérték (Monetary), illetve </w:t>
+      </w:r>
       <w:r>
         <w:lastRenderedPageBreak/>
-        <w:t xml:space="preserve">• A modell legerősebb jelzője a </w:t>
-      </w:r>
-      <w:proofErr w:type="spellStart"/>
-      <w:r>
-        <w:t>Monetary</w:t>
-      </w:r>
-      <w:proofErr w:type="spellEnd"/>
-      <w:r>
-        <w:t xml:space="preserve">, de a </w:t>
-      </w:r>
-      <w:proofErr w:type="spellStart"/>
-      <w:r>
-        <w:t>Frequency</w:t>
-      </w:r>
-      <w:proofErr w:type="spellEnd"/>
-      <w:r>
-        <w:t xml:space="preserve"> és </w:t>
-      </w:r>
-      <w:proofErr w:type="spellStart"/>
-      <w:r>
-        <w:t>Recency</w:t>
-      </w:r>
-      <w:proofErr w:type="spellEnd"/>
-      <w:r>
-        <w:t xml:space="preserve"> is hozzájárul a végső </w:t>
-      </w:r>
-      <w:proofErr w:type="spellStart"/>
-      <w:r>
-        <w:t>predikcióhoz</w:t>
-      </w:r>
-      <w:proofErr w:type="spellEnd"/>
-      <w:r>
-        <w:t>.</w:t>
+        <w:t>nagyobb a vásárlási gyakoriság (Frequency), és általában frissebb a legutóbbi vásárlás (alacsony Recency).</w:t>
+      </w:r>
+    </w:p>
+    <w:p>
+      <w:r>
+        <w:t>• A 3, 5, 7 és 9 minta 0-ás predikciót kapott, tehát alacsony értékű ügyfélként lett besorolva. Ezeknél alacsony a tranzakciós összérték, ritkább a vásárlás, vagy régebbi az utolsó vásárlás időpontja.</w:t>
+      </w:r>
+    </w:p>
+    <w:p>
+      <w:r>
+        <w:t>• A modell legerősebb jelzője a Monetary, de a Frequency és Recency is hozzájárul a végső predikcióhoz.</w:t>
       </w:r>
     </w:p>
     <w:p/>
     <w:p>
       <w:r>
+        <w:rPr>
+          <w:noProof/>
+        </w:rPr>
         <w:drawing>
           <wp:inline distT="0" distB="0" distL="0" distR="0" wp14:anchorId="700AE380" wp14:editId="2993F708">
             <wp:extent cx="5943600" cy="3863975"/>
@@ -1989,7 +934,7 @@
                     <pic:cNvPicPr/>
                   </pic:nvPicPr>
                   <pic:blipFill>
-                    <a:blip r:embed="rId5"/>
+                    <a:blip r:embed="rId6"/>
                     <a:stretch>
                       <a:fillRect/>
                     </a:stretch>
@@ -3659,6 +2604,41 @@
       <w:szCs w:val="20"/>
     </w:rPr>
   </w:style>
+  <w:style w:type="character" w:styleId="Hiperhivatkozs">
+    <w:name w:val="Hyperlink"/>
+    <w:basedOn w:val="Bekezdsalapbettpusa"/>
+    <w:uiPriority w:val="99"/>
+    <w:unhideWhenUsed/>
+    <w:rsid w:val="00F31D16"/>
+    <w:rPr>
+      <w:color w:val="467886" w:themeColor="hyperlink"/>
+      <w:u w:val="single"/>
+    </w:rPr>
+  </w:style>
+  <w:style w:type="character" w:styleId="Feloldatlanmegemlts">
+    <w:name w:val="Unresolved Mention"/>
+    <w:basedOn w:val="Bekezdsalapbettpusa"/>
+    <w:uiPriority w:val="99"/>
+    <w:semiHidden/>
+    <w:unhideWhenUsed/>
+    <w:rsid w:val="00F31D16"/>
+    <w:rPr>
+      <w:color w:val="605E5C"/>
+      <w:shd w:val="clear" w:color="auto" w:fill="E1DFDD"/>
+    </w:rPr>
+  </w:style>
+  <w:style w:type="character" w:styleId="Mrltotthiperhivatkozs">
+    <w:name w:val="FollowedHyperlink"/>
+    <w:basedOn w:val="Bekezdsalapbettpusa"/>
+    <w:uiPriority w:val="99"/>
+    <w:semiHidden/>
+    <w:unhideWhenUsed/>
+    <w:rsid w:val="001C06FF"/>
+    <w:rPr>
+      <w:color w:val="96607D" w:themeColor="followedHyperlink"/>
+      <w:u w:val="single"/>
+    </w:rPr>
+  </w:style>
 </w:styles>
 </file>
 

</xml_diff>